<commit_message>
Apply 15-badge model and six levels across all files; rebuild package
- Badges: C1-C5 core, B1-B5 specialist, A1-A5 advanced; no certification.
- Levels L0-L5: L1/L2 automatic, leveling tests for L3-L5, annual top 10%.
- Removed the Google Workspace HIPAA BAA risk everywhere.
- Re-exported all docs, deck (24 slides), infographic and web app PDFs;
  rebuilt the package folder and zip.

Co-Authored-By: Claude Opus 5.5 <noreply@anthropic.com>
Claude-Session: https://claude.ai/code/session_01Ss3iUTtC1tcixrNE6cvHqv
</commit_message>
<xml_diff>
--- a/oon-operating-model/ER-OON-2027-Package/02-Documents/01-Executive-Summary.docx
+++ b/oon-operating-model/ER-OON-2027-Package/02-Documents/01-Executive-Summary.docx
@@ -216,7 +216,7 @@
         <w:t xml:space="preserve">Pay and promotion follow skill.</w:t>
       </w:r>
       <w:r>
-        <w:t xml:space="preserve"> Four specialist levels (L1–L4) are earned through nine skill badges, and L5 is the leadership level for team leads and managers. Badges are earned in quarterly test windows and kept through a semiannual review.</w:t>
+        <w:t xml:space="preserve"> Six levels (L0–L5) are earned through 15 skill badges in three families: C Core, B Specialist and A Advanced. L1 and L2 come automatically once the badges are held; L3, L4 and L5 need a leveling test, and L5 is the leadership level for team leads and managers. Every December the top 10% of each level earn their missing badges. Badges are earned in quarterly test windows and kept through a semiannual review.</w:t>
       </w:r>
     </w:p>
     <w:p>
@@ -279,7 +279,7 @@
         </w:numPr>
       </w:pPr>
       <w:r>
-        <w:t xml:space="preserve">☐ Approve the five levels, nine badges and pay bands, the quarterly test windows and the semiannual review, including the badge-loss rules, subject to HR and legal review.</w:t>
+        <w:t xml:space="preserve">☐ Approve the six levels (L0–L5), 15 badges, leveling tests and pay bands, the quarterly test windows and the semiannual review, including the badge-loss rules, subject to HR and legal review.</w:t>
       </w:r>
     </w:p>
     <w:p>
@@ -797,6 +797,41 @@
           <w:p>
             <w:pPr/>
             <w:r>
+              <w:t xml:space="preserve">L0 Junior RCM Specialist</w:t>
+            </w:r>
+          </w:p>
+        </w:tc>
+        <w:tc>
+          <w:tcPr>
+            <w:tcW w:w="3120" w:type="dxa"/>
+          </w:tcPr>
+          <w:p>
+            <w:pPr/>
+            <w:r>
+              <w:t xml:space="preserve">New hire; no badges yet</w:t>
+            </w:r>
+          </w:p>
+        </w:tc>
+        <w:tc>
+          <w:tcPr>
+            <w:tcW w:w="3120" w:type="dxa"/>
+          </w:tcPr>
+          <w:p>
+            <w:pPr/>
+            <w:r>
+              <w:t xml:space="preserve">1,000–1,100</w:t>
+            </w:r>
+          </w:p>
+        </w:tc>
+      </w:tr>
+      <w:tr>
+        <w:tc>
+          <w:tcPr>
+            <w:tcW w:w="3120" w:type="dxa"/>
+          </w:tcPr>
+          <w:p>
+            <w:pPr/>
+            <w:r>
               <w:t xml:space="preserve">L1 RCM Specialist I</w:t>
             </w:r>
           </w:p>
@@ -808,7 +843,7 @@
           <w:p>
             <w:pPr/>
             <w:r>
-              <w:t xml:space="preserve">Earning the 5 core badges</w:t>
+              <w:t xml:space="preserve">All 5 C badges; automatic</w:t>
             </w:r>
           </w:p>
         </w:tc>
@@ -843,7 +878,7 @@
           <w:p>
             <w:pPr/>
             <w:r>
-              <w:t xml:space="preserve">All 5 core badges</w:t>
+              <w:t xml:space="preserve">5 C + B1 or B2 + 2 of B3, B4, B5; automatic</w:t>
             </w:r>
           </w:p>
         </w:tc>
@@ -878,7 +913,7 @@
           <w:p>
             <w:pPr/>
             <w:r>
-              <w:t xml:space="preserve">Core badges + 2 advanced from A1, A2, A3; top 40% Net Recovery</w:t>
+              <w:t xml:space="preserve">5 C + 5 B + 1 of 5 A; L3 leveling test</w:t>
             </w:r>
           </w:p>
         </w:tc>
@@ -913,7 +948,7 @@
           <w:p>
             <w:pPr/>
             <w:r>
-              <w:t xml:space="preserve">Core badges + A2, A4 and A1 or A3; top 20%; teaches</w:t>
+              <w:t xml:space="preserve">5 C + 5 B + 3 of 5 A; L4 leveling test</w:t>
             </w:r>
           </w:p>
         </w:tc>
@@ -948,7 +983,7 @@
           <w:p>
             <w:pPr/>
             <w:r>
-              <w:t xml:space="preserve">L3 or L4 + coaching assessment</w:t>
+              <w:t xml:space="preserve">5 C + 5 B + 4 of 5 A; L5 leveling test with coaching assessment; team lead post</w:t>
             </w:r>
           </w:p>
         </w:tc>
@@ -983,7 +1018,7 @@
           <w:p>
             <w:pPr/>
             <w:r>
-              <w:t xml:space="preserve">12 months as team lead, or L4 + leadership training</w:t>
+              <w:t xml:space="preserve">5 C + 5 B + 4 of 5 A; L5 leveling test with leadership assessment; manager post</w:t>
             </w:r>
           </w:p>
         </w:tc>
@@ -1003,7 +1038,7 @@
     <w:p>
       <w:pPr/>
       <w:r>
-        <w:t xml:space="preserve">Advanced badges add $45–70 a month. The quarterly bonus is 5–15% of base, paid on Net Recovery, quality and deadlines. Members who lose 25% of their badges at a semiannual review go on probation and coaching; losing 50% leads to termination, from December 2027. The full rules are in the </w:t>
+        <w:t xml:space="preserve">Each A badge adds $50 a month, up to 2 badges ($100 a month). The quarterly bonus is 5–15% of base, paid on Net Recovery, quality and deadlines. Members who lose 25% of their badges at a semiannual review go on probation and coaching; losing 50% leads to termination, from December 2027. The full rules are in the </w:t>
       </w:r>
       <w:hyperlink r:id="rId3" w:history="1">
         <w:r>
@@ -1395,7 +1430,7 @@
           <w:p>
             <w:pPr/>
             <w:r>
-              <w:t xml:space="preserve">Top 10% receive role badges; bottom 10% join the Academy at L1; everyone else takes the optional skill assessment and role badge tests in the February or March window</w:t>
+              <w:t xml:space="preserve">Top 10% receive their role badges (Negotiator: C2, C5, B2, B5, A2; Coder: C1, C5, B1, A3; Biller: C1–C4, B5, plus B3 for MVA or workers' comp); bottom 10% join the Academy at L1; everyone else takes the optional skill assessment and role badge tests in the February or March window</w:t>
             </w:r>
           </w:p>
         </w:tc>
@@ -1419,64 +1454,64 @@
           <w:p>
             <w:pPr/>
             <w:r>
-              <w:t xml:space="preserve">2 · Core skills</w:t>
-            </w:r>
-          </w:p>
-        </w:tc>
-        <w:tc>
-          <w:tcPr>
-            <w:tcW w:w="1872" w:type="dxa"/>
-          </w:tcPr>
-          <w:p>
-            <w:pPr/>
-            <w:r>
-              <w:t xml:space="preserve">Apr–Jun 2027</w:t>
-            </w:r>
-          </w:p>
-        </w:tc>
-        <w:tc>
-          <w:tcPr>
-            <w:tcW w:w="1872" w:type="dxa"/>
-          </w:tcPr>
-          <w:p>
-            <w:pPr/>
-            <w:r>
-              <w:t xml:space="preserve">Anyone missing a core badge</w:t>
-            </w:r>
-          </w:p>
-        </w:tc>
-        <w:tc>
-          <w:tcPr>
-            <w:tcW w:w="1872" w:type="dxa"/>
-          </w:tcPr>
-          <w:p>
-            <w:pPr/>
-            <w:r>
-              <w:t xml:space="preserve">Billers learn C2; negotiators and coders learn C1, C3 and C4; each paired with a badge-holder in their team</w:t>
-            </w:r>
-          </w:p>
-        </w:tc>
-        <w:tc>
-          <w:tcPr>
-            <w:tcW w:w="1872" w:type="dxa"/>
-          </w:tcPr>
-          <w:p>
-            <w:pPr/>
-            <w:r>
-              <w:t xml:space="preserve">All 5 core badges by June 30</w:t>
-            </w:r>
-          </w:p>
-        </w:tc>
-      </w:tr>
-      <w:tr>
-        <w:tc>
-          <w:tcPr>
-            <w:tcW w:w="1872" w:type="dxa"/>
-          </w:tcPr>
-          <w:p>
-            <w:pPr/>
-            <w:r>
-              <w:t xml:space="preserve">3 · Advanced</w:t>
+              <w:t xml:space="preserve">2 · Missing badges</w:t>
+            </w:r>
+          </w:p>
+        </w:tc>
+        <w:tc>
+          <w:tcPr>
+            <w:tcW w:w="1872" w:type="dxa"/>
+          </w:tcPr>
+          <w:p>
+            <w:pPr/>
+            <w:r>
+              <w:t xml:space="preserve">Apr–Dec 2027</w:t>
+            </w:r>
+          </w:p>
+        </w:tc>
+        <w:tc>
+          <w:tcPr>
+            <w:tcW w:w="1872" w:type="dxa"/>
+          </w:tcPr>
+          <w:p>
+            <w:pPr/>
+            <w:r>
+              <w:t xml:space="preserve">Anyone missing a badge for their level</w:t>
+            </w:r>
+          </w:p>
+        </w:tc>
+        <w:tc>
+          <w:tcPr>
+            <w:tcW w:w="1872" w:type="dxa"/>
+          </w:tcPr>
+          <w:p>
+            <w:pPr/>
+            <w:r>
+              <w:t xml:space="preserve">Cross-training on the missing badges: negotiators learn C1, C3 and C4; coders learn C2, C3 and C4; billers learn C5; each paired with a badge-holder in their team</w:t>
+            </w:r>
+          </w:p>
+        </w:tc>
+        <w:tc>
+          <w:tcPr>
+            <w:tcW w:w="1872" w:type="dxa"/>
+          </w:tcPr>
+          <w:p>
+            <w:pPr/>
+            <w:r>
+              <w:t xml:space="preserve">All badges for the confirmed level by December 31, 2027</w:t>
+            </w:r>
+          </w:p>
+        </w:tc>
+      </w:tr>
+      <w:tr>
+        <w:tc>
+          <w:tcPr>
+            <w:tcW w:w="1872" w:type="dxa"/>
+          </w:tcPr>
+          <w:p>
+            <w:pPr/>
+            <w:r>
+              <w:t xml:space="preserve">3 · Specialist and advanced</w:t>
             </w:r>
           </w:p>
         </w:tc>
@@ -1498,18 +1533,18 @@
           <w:p>
             <w:pPr/>
             <w:r>
-              <w:t xml:space="preserve">L2 and above</w:t>
-            </w:r>
-          </w:p>
-        </w:tc>
-        <w:tc>
-          <w:tcPr>
-            <w:tcW w:w="1872" w:type="dxa"/>
-          </w:tcPr>
-          <w:p>
-            <w:pPr/>
-            <w:r>
-              <w:t xml:space="preserve">Coding, IDR packet and offer, MVA, payer strategy</w:t>
+              <w:t xml:space="preserve">L1 and above</w:t>
+            </w:r>
+          </w:p>
+        </w:tc>
+        <w:tc>
+          <w:tcPr>
+            <w:tcW w:w="1872" w:type="dxa"/>
+          </w:tcPr>
+          <w:p>
+            <w:pPr/>
+            <w:r>
+              <w:t xml:space="preserve">B badges (coding, IDR process, MVA and workers' comp, payer strategy, payer outreach) and A badges (reporting, IDR strategy, medical terminology, billing strategy, innovation)</w:t>
             </w:r>
           </w:p>
         </w:tc>
@@ -1555,29 +1590,29 @@
           <w:p>
             <w:pPr/>
             <w:r>
-              <w:t xml:space="preserve">Groups of 4–6</w:t>
-            </w:r>
-          </w:p>
-        </w:tc>
-        <w:tc>
-          <w:tcPr>
-            <w:tcW w:w="1872" w:type="dxa"/>
-          </w:tcPr>
-          <w:p>
-            <w:pPr/>
-            <w:r>
-              <w:t xml:space="preserve">2 weeks of Academy, then supervised work in a team</w:t>
-            </w:r>
-          </w:p>
-        </w:tc>
-        <w:tc>
-          <w:tcPr>
-            <w:tcW w:w="1872" w:type="dxa"/>
-          </w:tcPr>
-          <w:p>
-            <w:pPr/>
-            <w:r>
-              <w:t xml:space="preserve">On track for L2 at 6 months</w:t>
+              <w:t xml:space="preserve">Groups of 4–6 at L0</w:t>
+            </w:r>
+          </w:p>
+        </w:tc>
+        <w:tc>
+          <w:tcPr>
+            <w:tcW w:w="1872" w:type="dxa"/>
+          </w:tcPr>
+          <w:p>
+            <w:pPr/>
+            <w:r>
+              <w:t xml:space="preserve">2 weeks of Academy, then the C badges with supervised work in a team</w:t>
+            </w:r>
+          </w:p>
+        </w:tc>
+        <w:tc>
+          <w:tcPr>
+            <w:tcW w:w="1872" w:type="dxa"/>
+          </w:tcPr>
+          <w:p>
+            <w:pPr/>
+            <w:r>
+              <w:t xml:space="preserve">L1 automatically at about 6 months</w:t>
             </w:r>
           </w:p>
         </w:tc>
@@ -2032,7 +2067,7 @@
         </w:numPr>
       </w:pPr>
       <w:r>
-        <w:t xml:space="preserve">Advanced-badge allowances: $45–70 per holder per month.</w:t>
+        <w:t xml:space="preserve">A-badge allowances: $50 per A badge a month, up to 2 per member.</w:t>
       </w:r>
     </w:p>
     <w:p>
@@ -2326,7 +2361,7 @@
           <w:p>
             <w:pPr/>
             <w:r>
-              <w:t xml:space="preserve">BAAs with ClickUp, Google Workspace (for the Studio) and our LLM provider</w:t>
+              <w:t xml:space="preserve">BAAs with ClickUp and our LLM provider</w:t>
             </w:r>
           </w:p>
         </w:tc>
@@ -3190,30 +3225,6 @@
             <w:pPr/>
             <w:r>
               <w:t xml:space="preserve">Retention bonus through January 2028; a Senior Specialist path that doesn't require managing</w:t>
-            </w:r>
-          </w:p>
-        </w:tc>
-      </w:tr>
-      <w:tr>
-        <w:tc>
-          <w:tcPr>
-            <w:tcW w:w="4680" w:type="dxa"/>
-          </w:tcPr>
-          <w:p>
-            <w:pPr/>
-            <w:r>
-              <w:t xml:space="preserve">Claim data enters the Studio before Google Workspace is covered</w:t>
-            </w:r>
-          </w:p>
-        </w:tc>
-        <w:tc>
-          <w:tcPr>
-            <w:tcW w:w="4680" w:type="dxa"/>
-          </w:tcPr>
-          <w:p>
-            <w:pPr/>
-            <w:r>
-              <w:t xml:space="preserve">A HIPAA BAA for Google Workspace before real PHI goes in</w:t>
             </w:r>
           </w:p>
         </w:tc>

</xml_diff>

<commit_message>
Remove all pay and bonus money except the night rota pool; rebuild package
- Removed salary bands, raise percentages, bonus targets, badge
  allowances, retention and merit figures, hourly rates, and Model B's
  gainshare, bounty board and US bonus.
- Recomputed Model B costs without its bonus; Model C now captures
  about 60-75% of Model B's saving.
- Re-exported all docs, deck, infographic and web app PDFs; rebuilt the
  package and zip.

Co-Authored-By: Claude Opus 5.5 <noreply@anthropic.com>
Claude-Session: https://claude.ai/code/session_01Ss3iUTtC1tcixrNE6cvHqv
</commit_message>
<xml_diff>
--- a/oon-operating-model/ER-OON-2027-Package/02-Documents/01-Executive-Summary.docx
+++ b/oon-operating-model/ER-OON-2027-Package/02-Documents/01-Executive-Summary.docx
@@ -279,7 +279,7 @@
         </w:numPr>
       </w:pPr>
       <w:r>
-        <w:t xml:space="preserve">☐ Approve the six levels (L0–L5), 15 badges, leveling tests and pay bands, the quarterly test windows and the semiannual review, including the badge-loss rules, subject to HR and legal review.</w:t>
+        <w:t xml:space="preserve">☐ Approve the six levels (L0–L5), 15 badges, leveling tests, the quarterly test windows and the semiannual review, including the badge-loss rules, subject to HR and legal review.</w:t>
       </w:r>
     </w:p>
     <w:p>
@@ -733,7 +733,7 @@
         <w:rPr>
           <w:b/>
         </w:rPr>
-        <w:t xml:space="preserve">Careers and pay (USD per month):</w:t>
+        <w:t xml:space="preserve">Careers:</w:t>
       </w:r>
     </w:p>
     <w:tbl>
@@ -744,9 +744,8 @@
         <w:tblLook w:val="04A0" w:firstRow="1" w:lastRow="0" w:firstColumn="0" w:lastColumn="0" w:noHBand="0" w:noVBand="1"/>
       </w:tblPr>
       <w:tblGrid>
-        <w:gridCol w:w="3120"/>
-        <w:gridCol w:w="3120"/>
-        <w:gridCol w:w="3120"/>
+        <w:gridCol w:w="4680"/>
+        <w:gridCol w:w="4680"/>
       </w:tblGrid>
       <w:tr>
         <w:trPr>
@@ -754,7 +753,7 @@
         </w:trPr>
         <w:tc>
           <w:tcPr>
-            <w:tcW w:w="3120" w:type="dxa"/>
+            <w:tcW w:w="4680" w:type="dxa"/>
             <w:shd w:val="clear" w:color="auto" w:fill="F2F2F2"/>
           </w:tcPr>
           <w:p>
@@ -766,7 +765,7 @@
         </w:tc>
         <w:tc>
           <w:tcPr>
-            <w:tcW w:w="3120" w:type="dxa"/>
+            <w:tcW w:w="4680" w:type="dxa"/>
             <w:shd w:val="clear" w:color="auto" w:fill="F2F2F2"/>
           </w:tcPr>
           <w:p>
@@ -776,23 +775,11 @@
             </w:r>
           </w:p>
         </w:tc>
-        <w:tc>
-          <w:tcPr>
-            <w:tcW w:w="3120" w:type="dxa"/>
-            <w:shd w:val="clear" w:color="auto" w:fill="F2F2F2"/>
-          </w:tcPr>
-          <w:p>
-            <w:pPr/>
-            <w:r>
-              <w:t xml:space="preserve">Band</w:t>
-            </w:r>
-          </w:p>
-        </w:tc>
-      </w:tr>
-      <w:tr>
-        <w:tc>
-          <w:tcPr>
-            <w:tcW w:w="3120" w:type="dxa"/>
+      </w:tr>
+      <w:tr>
+        <w:tc>
+          <w:tcPr>
+            <w:tcW w:w="4680" w:type="dxa"/>
           </w:tcPr>
           <w:p>
             <w:pPr/>
@@ -803,7 +790,7 @@
         </w:tc>
         <w:tc>
           <w:tcPr>
-            <w:tcW w:w="3120" w:type="dxa"/>
+            <w:tcW w:w="4680" w:type="dxa"/>
           </w:tcPr>
           <w:p>
             <w:pPr/>
@@ -812,22 +799,11 @@
             </w:r>
           </w:p>
         </w:tc>
-        <w:tc>
-          <w:tcPr>
-            <w:tcW w:w="3120" w:type="dxa"/>
-          </w:tcPr>
-          <w:p>
-            <w:pPr/>
-            <w:r>
-              <w:t xml:space="preserve">1,000–1,100</w:t>
-            </w:r>
-          </w:p>
-        </w:tc>
-      </w:tr>
-      <w:tr>
-        <w:tc>
-          <w:tcPr>
-            <w:tcW w:w="3120" w:type="dxa"/>
+      </w:tr>
+      <w:tr>
+        <w:tc>
+          <w:tcPr>
+            <w:tcW w:w="4680" w:type="dxa"/>
           </w:tcPr>
           <w:p>
             <w:pPr/>
@@ -838,7 +814,7 @@
         </w:tc>
         <w:tc>
           <w:tcPr>
-            <w:tcW w:w="3120" w:type="dxa"/>
+            <w:tcW w:w="4680" w:type="dxa"/>
           </w:tcPr>
           <w:p>
             <w:pPr/>
@@ -847,22 +823,11 @@
             </w:r>
           </w:p>
         </w:tc>
-        <w:tc>
-          <w:tcPr>
-            <w:tcW w:w="3120" w:type="dxa"/>
-          </w:tcPr>
-          <w:p>
-            <w:pPr/>
-            <w:r>
-              <w:t xml:space="preserve">1,000–1,300</w:t>
-            </w:r>
-          </w:p>
-        </w:tc>
-      </w:tr>
-      <w:tr>
-        <w:tc>
-          <w:tcPr>
-            <w:tcW w:w="3120" w:type="dxa"/>
+      </w:tr>
+      <w:tr>
+        <w:tc>
+          <w:tcPr>
+            <w:tcW w:w="4680" w:type="dxa"/>
           </w:tcPr>
           <w:p>
             <w:pPr/>
@@ -873,7 +838,7 @@
         </w:tc>
         <w:tc>
           <w:tcPr>
-            <w:tcW w:w="3120" w:type="dxa"/>
+            <w:tcW w:w="4680" w:type="dxa"/>
           </w:tcPr>
           <w:p>
             <w:pPr/>
@@ -882,22 +847,11 @@
             </w:r>
           </w:p>
         </w:tc>
-        <w:tc>
-          <w:tcPr>
-            <w:tcW w:w="3120" w:type="dxa"/>
-          </w:tcPr>
-          <w:p>
-            <w:pPr/>
-            <w:r>
-              <w:t xml:space="preserve">1,200–1,550</w:t>
-            </w:r>
-          </w:p>
-        </w:tc>
-      </w:tr>
-      <w:tr>
-        <w:tc>
-          <w:tcPr>
-            <w:tcW w:w="3120" w:type="dxa"/>
+      </w:tr>
+      <w:tr>
+        <w:tc>
+          <w:tcPr>
+            <w:tcW w:w="4680" w:type="dxa"/>
           </w:tcPr>
           <w:p>
             <w:pPr/>
@@ -908,7 +862,7 @@
         </w:tc>
         <w:tc>
           <w:tcPr>
-            <w:tcW w:w="3120" w:type="dxa"/>
+            <w:tcW w:w="4680" w:type="dxa"/>
           </w:tcPr>
           <w:p>
             <w:pPr/>
@@ -917,22 +871,11 @@
             </w:r>
           </w:p>
         </w:tc>
-        <w:tc>
-          <w:tcPr>
-            <w:tcW w:w="3120" w:type="dxa"/>
-          </w:tcPr>
-          <w:p>
-            <w:pPr/>
-            <w:r>
-              <w:t xml:space="preserve">1,400–1,800</w:t>
-            </w:r>
-          </w:p>
-        </w:tc>
-      </w:tr>
-      <w:tr>
-        <w:tc>
-          <w:tcPr>
-            <w:tcW w:w="3120" w:type="dxa"/>
+      </w:tr>
+      <w:tr>
+        <w:tc>
+          <w:tcPr>
+            <w:tcW w:w="4680" w:type="dxa"/>
           </w:tcPr>
           <w:p>
             <w:pPr/>
@@ -943,7 +886,7 @@
         </w:tc>
         <w:tc>
           <w:tcPr>
-            <w:tcW w:w="3120" w:type="dxa"/>
+            <w:tcW w:w="4680" w:type="dxa"/>
           </w:tcPr>
           <w:p>
             <w:pPr/>
@@ -952,22 +895,11 @@
             </w:r>
           </w:p>
         </w:tc>
-        <w:tc>
-          <w:tcPr>
-            <w:tcW w:w="3120" w:type="dxa"/>
-          </w:tcPr>
-          <w:p>
-            <w:pPr/>
-            <w:r>
-              <w:t xml:space="preserve">1,600–2,000</w:t>
-            </w:r>
-          </w:p>
-        </w:tc>
-      </w:tr>
-      <w:tr>
-        <w:tc>
-          <w:tcPr>
-            <w:tcW w:w="3120" w:type="dxa"/>
+      </w:tr>
+      <w:tr>
+        <w:tc>
+          <w:tcPr>
+            <w:tcW w:w="4680" w:type="dxa"/>
           </w:tcPr>
           <w:p>
             <w:pPr/>
@@ -978,7 +910,7 @@
         </w:tc>
         <w:tc>
           <w:tcPr>
-            <w:tcW w:w="3120" w:type="dxa"/>
+            <w:tcW w:w="4680" w:type="dxa"/>
           </w:tcPr>
           <w:p>
             <w:pPr/>
@@ -987,22 +919,11 @@
             </w:r>
           </w:p>
         </w:tc>
-        <w:tc>
-          <w:tcPr>
-            <w:tcW w:w="3120" w:type="dxa"/>
-          </w:tcPr>
-          <w:p>
-            <w:pPr/>
-            <w:r>
-              <w:t xml:space="preserve">1,400–2,000</w:t>
-            </w:r>
-          </w:p>
-        </w:tc>
-      </w:tr>
-      <w:tr>
-        <w:tc>
-          <w:tcPr>
-            <w:tcW w:w="3120" w:type="dxa"/>
+      </w:tr>
+      <w:tr>
+        <w:tc>
+          <w:tcPr>
+            <w:tcW w:w="4680" w:type="dxa"/>
           </w:tcPr>
           <w:p>
             <w:pPr/>
@@ -1013,7 +934,7 @@
         </w:tc>
         <w:tc>
           <w:tcPr>
-            <w:tcW w:w="3120" w:type="dxa"/>
+            <w:tcW w:w="4680" w:type="dxa"/>
           </w:tcPr>
           <w:p>
             <w:pPr/>
@@ -1022,23 +943,12 @@
             </w:r>
           </w:p>
         </w:tc>
-        <w:tc>
-          <w:tcPr>
-            <w:tcW w:w="3120" w:type="dxa"/>
-          </w:tcPr>
-          <w:p>
-            <w:pPr/>
-            <w:r>
-              <w:t xml:space="preserve">2,000–3,000</w:t>
-            </w:r>
-          </w:p>
-        </w:tc>
       </w:tr>
     </w:tbl>
     <w:p>
       <w:pPr/>
       <w:r>
-        <w:t xml:space="preserve">Each A badge adds $50 a month, up to 2 badges ($100 a month). The quarterly bonus is 5–15% of base, paid on Net Recovery, quality and deadlines. Members who lose 25% of their badges at a semiannual review go on probation and coaching; losing 50% leads to termination, from December 2027. The full rules are in the </w:t>
+        <w:t xml:space="preserve">Members who lose 25% of their badges at a semiannual review go on probation and coaching; losing 50% leads to termination, from December 2027. The full rules are in the </w:t>
       </w:r>
       <w:hyperlink r:id="rId3" w:history="1">
         <w:r>
@@ -1776,7 +1686,7 @@
           <w:p>
             <w:pPr/>
             <w:r>
-              <w:t xml:space="preserve">$18–22/hour × 2,080 hours, plus about 25% benefits and payroll taxes</w:t>
+              <w:t xml:space="preserve">Approximate Texas market rates for direct hires, plus about 25% benefits and payroll taxes</w:t>
             </w:r>
           </w:p>
         </w:tc>
@@ -1811,7 +1721,7 @@
           <w:p>
             <w:pPr/>
             <w:r>
-              <w:t xml:space="preserve">$25–30/hour × 2,080 hours, plus about 25% benefits and payroll taxes</w:t>
+              <w:t xml:space="preserve">Approximate Texas market rates for direct hires, plus about 25% benefits and payroll taxes</w:t>
             </w:r>
           </w:p>
         </w:tc>
@@ -1945,7 +1855,7 @@
         <w:t xml:space="preserve">Against the alternatives:</w:t>
       </w:r>
       <w:r>
-        <w:t xml:space="preserve"> Model A (7 people typing from tickets) costs $346,000–421,000 a year. Model B (3 people with a form-filling Cockpit) costs $206,000–261,000, but needs written Gateway approval and new software. Model C saves $94,000–114,000 a year against Model A today. The full analysis is in the </w:t>
+        <w:t xml:space="preserve"> Model A (7 people typing from tickets) costs $346,000–421,000 a year. Model B (3 people with a form-filling Cockpit) costs $192,000–244,000, but needs written Gateway approval and new software. Model C saves $94,000–114,000 a year against Model A today. The full analysis is in the </w:t>
       </w:r>
       <w:hyperlink r:id="rId6" w:history="1">
         <w:r>
@@ -2043,7 +1953,7 @@
         <w:rPr>
           <w:b/>
         </w:rPr>
-        <w:t xml:space="preserve">New costs in Lebanon are small:</w:t>
+        <w:t xml:space="preserve">The only new cost in Lebanon is the bridge night rota:</w:t>
       </w:r>
     </w:p>
     <w:p>
@@ -2056,48 +1966,6 @@
       </w:pPr>
       <w:r>
         <w:t xml:space="preserve">Bridge night rota: a $30,000 quarterly bonus pool, up to $120,000 a year, shared at $300–3,000 per member a quarter.</w:t>
-      </w:r>
-    </w:p>
-    <w:p>
-      <w:pPr>
-        <w:pStyle w:val="ListParagraph"/>
-        <w:numPr>
-          <w:ilvl w:val="0"/>
-          <w:numId w:val="9"/>
-        </w:numPr>
-      </w:pPr>
-      <w:r>
-        <w:t xml:space="preserve">A-badge allowances: $50 per A badge a month, up to 2 per member.</w:t>
-      </w:r>
-    </w:p>
-    <w:p>
-      <w:pPr>
-        <w:pStyle w:val="ListParagraph"/>
-        <w:numPr>
-          <w:ilvl w:val="0"/>
-          <w:numId w:val="9"/>
-        </w:numPr>
-      </w:pPr>
-      <w:r>
-        <w:t xml:space="preserve">Guaranteed raises for anyone who moves up a level on April 1, 2027.</w:t>
-      </w:r>
-    </w:p>
-    <w:p>
-      <w:pPr>
-        <w:pStyle w:val="ListParagraph"/>
-        <w:numPr>
-          <w:ilvl w:val="0"/>
-          <w:numId w:val="9"/>
-        </w:numPr>
-      </w:pPr>
-      <w:r>
-        <w:t xml:space="preserve">The transition retention bonus for critical staff.</w:t>
-      </w:r>
-    </w:p>
-    <w:p>
-      <w:pPr/>
-      <w:r>
-        <w:t xml:space="preserve">Team lead pay needs no raise, because the new band matches today's range.</w:t>
       </w:r>
     </w:p>
     <w:p>
@@ -3224,7 +3092,7 @@
           <w:p>
             <w:pPr/>
             <w:r>
-              <w:t xml:space="preserve">Retention bonus through January 2028; a Senior Specialist path that doesn't require managing</w:t>
+              <w:t xml:space="preserve">Early, open communication and a Senior Specialist path that doesn't require managing</w:t>
             </w:r>
           </w:p>
         </w:tc>

</xml_diff>